<commit_message>
restructure and add proper README.md
</commit_message>
<xml_diff>
--- a/doc/Go-Bericht.docx
+++ b/doc/Go-Bericht.docx
@@ -942,7 +942,27 @@
           <w:sz w:val="22"/>
           <w:szCs w:val="22"/>
         </w:rPr>
-        <w:t>Datei: slices/main.go</w:t>
+        <w:t xml:space="preserve">Datei: </w:t>
+      </w:r>
+      <w:r>
+        <w:rPr>
+          <w:rFonts w:ascii="Arial" w:hAnsi="Arial" w:cs="Arial"/>
+          <w:i/>
+          <w:iCs/>
+          <w:sz w:val="22"/>
+          <w:szCs w:val="22"/>
+        </w:rPr>
+        <w:t>code/</w:t>
+      </w:r>
+      <w:r>
+        <w:rPr>
+          <w:rFonts w:ascii="Arial" w:hAnsi="Arial" w:cs="Arial"/>
+          <w:i/>
+          <w:iCs/>
+          <w:sz w:val="22"/>
+          <w:szCs w:val="22"/>
+        </w:rPr>
+        <w:t>slices/main.go</w:t>
       </w:r>
     </w:p>
     <w:p>
@@ -1195,7 +1215,27 @@
           <w:sz w:val="22"/>
           <w:szCs w:val="22"/>
         </w:rPr>
-        <w:t>Datei: slices/main.go</w:t>
+        <w:t xml:space="preserve">Datei: </w:t>
+      </w:r>
+      <w:r>
+        <w:rPr>
+          <w:rFonts w:ascii="Arial" w:hAnsi="Arial" w:cs="Arial"/>
+          <w:i/>
+          <w:iCs/>
+          <w:sz w:val="22"/>
+          <w:szCs w:val="22"/>
+        </w:rPr>
+        <w:t>code/</w:t>
+      </w:r>
+      <w:r>
+        <w:rPr>
+          <w:rFonts w:ascii="Arial" w:hAnsi="Arial" w:cs="Arial"/>
+          <w:i/>
+          <w:iCs/>
+          <w:sz w:val="22"/>
+          <w:szCs w:val="22"/>
+        </w:rPr>
+        <w:t>slices/main.go</w:t>
       </w:r>
     </w:p>
     <w:p>
@@ -1550,7 +1590,27 @@
           <w:sz w:val="22"/>
           <w:szCs w:val="22"/>
         </w:rPr>
-        <w:t>Datei: maps/main.go</w:t>
+        <w:t xml:space="preserve">Datei: </w:t>
+      </w:r>
+      <w:r>
+        <w:rPr>
+          <w:rFonts w:ascii="Arial" w:hAnsi="Arial" w:cs="Arial"/>
+          <w:i/>
+          <w:iCs/>
+          <w:sz w:val="22"/>
+          <w:szCs w:val="22"/>
+        </w:rPr>
+        <w:t>code/</w:t>
+      </w:r>
+      <w:r>
+        <w:rPr>
+          <w:rFonts w:ascii="Arial" w:hAnsi="Arial" w:cs="Arial"/>
+          <w:i/>
+          <w:iCs/>
+          <w:sz w:val="22"/>
+          <w:szCs w:val="22"/>
+        </w:rPr>
+        <w:t>maps/main.go</w:t>
       </w:r>
     </w:p>
     <w:p>
@@ -1735,7 +1795,27 @@
           <w:sz w:val="22"/>
           <w:szCs w:val="22"/>
         </w:rPr>
-        <w:t>Datei: maps/main.go</w:t>
+        <w:t xml:space="preserve">Datei: </w:t>
+      </w:r>
+      <w:r>
+        <w:rPr>
+          <w:rFonts w:ascii="Arial" w:hAnsi="Arial" w:cs="Arial"/>
+          <w:i/>
+          <w:iCs/>
+          <w:sz w:val="22"/>
+          <w:szCs w:val="22"/>
+        </w:rPr>
+        <w:t>code/</w:t>
+      </w:r>
+      <w:r>
+        <w:rPr>
+          <w:rFonts w:ascii="Arial" w:hAnsi="Arial" w:cs="Arial"/>
+          <w:i/>
+          <w:iCs/>
+          <w:sz w:val="22"/>
+          <w:szCs w:val="22"/>
+        </w:rPr>
+        <w:t>maps/main.go</w:t>
       </w:r>
     </w:p>
     <w:p>
@@ -2246,7 +2326,27 @@
           <w:sz w:val="22"/>
           <w:szCs w:val="22"/>
         </w:rPr>
-        <w:t>Datei: structural-nominal-typing/main.go</w:t>
+        <w:t xml:space="preserve">Datei: </w:t>
+      </w:r>
+      <w:r>
+        <w:rPr>
+          <w:rFonts w:ascii="Arial" w:hAnsi="Arial" w:cs="Arial"/>
+          <w:i/>
+          <w:iCs/>
+          <w:sz w:val="22"/>
+          <w:szCs w:val="22"/>
+        </w:rPr>
+        <w:t>code/</w:t>
+      </w:r>
+      <w:r>
+        <w:rPr>
+          <w:rFonts w:ascii="Arial" w:hAnsi="Arial" w:cs="Arial"/>
+          <w:i/>
+          <w:iCs/>
+          <w:sz w:val="22"/>
+          <w:szCs w:val="22"/>
+        </w:rPr>
+        <w:t>structural-nominal-typing/main.go</w:t>
       </w:r>
     </w:p>
     <w:p>
@@ -3254,7 +3354,27 @@
           <w:sz w:val="22"/>
           <w:szCs w:val="22"/>
         </w:rPr>
-        <w:t>Datei: defer-panic-recover/main.go</w:t>
+        <w:t xml:space="preserve">Datei: </w:t>
+      </w:r>
+      <w:r>
+        <w:rPr>
+          <w:rFonts w:ascii="Arial" w:hAnsi="Arial" w:cs="Arial"/>
+          <w:i/>
+          <w:iCs/>
+          <w:sz w:val="22"/>
+          <w:szCs w:val="22"/>
+        </w:rPr>
+        <w:t>code/</w:t>
+      </w:r>
+      <w:r>
+        <w:rPr>
+          <w:rFonts w:ascii="Arial" w:hAnsi="Arial" w:cs="Arial"/>
+          <w:i/>
+          <w:iCs/>
+          <w:sz w:val="22"/>
+          <w:szCs w:val="22"/>
+        </w:rPr>
+        <w:t>defer-panic-recover/main.go</w:t>
       </w:r>
     </w:p>
     <w:p>
@@ -4355,7 +4475,27 @@
           <w:sz w:val="22"/>
           <w:szCs w:val="22"/>
         </w:rPr>
-        <w:t>Datei: sw9-ex3/main.go</w:t>
+        <w:t xml:space="preserve">Datei: </w:t>
+      </w:r>
+      <w:r>
+        <w:rPr>
+          <w:rFonts w:ascii="Arial" w:hAnsi="Arial" w:cs="Arial"/>
+          <w:i/>
+          <w:iCs/>
+          <w:sz w:val="22"/>
+          <w:szCs w:val="22"/>
+        </w:rPr>
+        <w:t>code/</w:t>
+      </w:r>
+      <w:r>
+        <w:rPr>
+          <w:rFonts w:ascii="Arial" w:hAnsi="Arial" w:cs="Arial"/>
+          <w:i/>
+          <w:iCs/>
+          <w:sz w:val="22"/>
+          <w:szCs w:val="22"/>
+        </w:rPr>
+        <w:t>sw9-ex3/main.go</w:t>
       </w:r>
     </w:p>
     <w:p>

</xml_diff>